<commit_message>
Apply Bonferroni correction to MANOVA univariate follow-ups
Adds the Bonferroni-adjusted alpha (p < 0.008 = 0.05/6) to the univariate
follow-ups of the repeated-measures MANOVA, matching the Rohlfs et al.
(2023) BRAMS validation approach:
- statistical-analysis section now states the Bonferroni adjustment
- MANOVA D1->D7 table: significance markers use p < 0.008; table note
  updated
- results text notes that only vigour and fatigue survive the correction
  (tension p=0.014 and confusion p=0.049 no longer significant),
  reinforcing that the effect is concentrated on the energy-fatigue axis

No figures or other numbers change. 13 tables, 12 figures. Anonymized;
leak scan clean.

Co-Authored-By: Claude Opus 4.8 <noreply@anthropic.com>
Claude-Session: https://claude.ai/code/session_01P7yGiDeoGDyjWvPWQVsUrj
</commit_message>
<xml_diff>
--- a/Artigos/Relatorio_Avancado_Perfil_Humor.docx
+++ b/Artigos/Relatorio_Avancado_Perfil_Humor.docx
@@ -348,7 +348,7 @@
           <w:b w:val="0"/>
           <w:sz w:val="24"/>
         </w:rPr>
-        <w:t>Como confirmação robusta, as comparações Dia 1 → Dia 7 e pré → pós foram reanalisadas por análise multivariada de variância (MANOVA) de medidas repetidas sobre os escores T, que testa as seis dimensões em conjunto e controla o erro de múltiplas comparações (lambda de Wilks, F e eta-quadrado parcial — η²ₚ; 0,01 pequeno; 0,06 médio; 0,14 grande). A associação entre as dimensões foi quantificada pela correlação de Spearman (ρ). Por fim, a relação entre o pico de velocidade do T-CAR e a fadiga foi analisada por regressão, e um limiar de pico de velocidade foi estabelecido pelo índice de Youden — que maximiza a soma de sensibilidade e especificidade —, com a qualidade de discriminação avaliada pela área sob a curva ROC. Adotou-se nível de significância de 5% (p &lt; 0,05), com as análises conduzidas em ambiente Python (bibliotecas pandas, SciPy e statsmodels).</w:t>
+        <w:t>Como confirmação robusta, as comparações Dia 1 → Dia 7 e pré → pós foram reanalisadas por análise multivariada de variância (MANOVA) de medidas repetidas sobre os escores T, que testa as seis dimensões em conjunto e controla o erro de múltiplas comparações (lambda de Wilks, F e eta-quadrado parcial — η²ₚ; 0,01 pequeno; 0,06 médio; 0,14 grande); nos testes univariados de acompanhamento da MANOVA, aplicou-se o ajuste de Bonferroni ao nível de significância, dividindo 0,05 pelas seis dimensões (α = 0,008), para controlar o erro do tipo I. A associação entre as dimensões foi quantificada pela correlação de Spearman (ρ). Por fim, a relação entre o pico de velocidade do T-CAR e a fadiga foi analisada por regressão, e um limiar de pico de velocidade foi estabelecido pelo índice de Youden — que maximiza a soma de sensibilidade e especificidade —, com a qualidade de discriminação avaliada pela área sob a curva ROC. Adotou-se nível de significância de 5% (p &lt; 0,05), com as análises conduzidas em ambiente Python (bibliotecas pandas, SciPy e statsmodels).</w:t>
       </w:r>
     </w:p>
     <w:p>
@@ -9043,7 +9043,7 @@
                 <w:rFonts w:ascii="Times New Roman" w:hAnsi="Times New Roman"/>
                 <w:sz w:val="17"/>
               </w:rPr>
-              <w:t>0,014*</w:t>
+              <w:t>0,014</w:t>
             </w:r>
           </w:p>
         </w:tc>
@@ -10133,7 +10133,7 @@
                 <w:rFonts w:ascii="Times New Roman" w:hAnsi="Times New Roman"/>
                 <w:sz w:val="17"/>
               </w:rPr>
-              <w:t>0,049*</w:t>
+              <w:t>0,049</w:t>
             </w:r>
           </w:p>
         </w:tc>
@@ -10196,7 +10196,7 @@
           <w:i/>
           <w:sz w:val="17"/>
         </w:rPr>
-        <w:t>Wilks λ = 0,283; F(6,15) = 6,32; p = 0,002; η²ₚ = 0,72. * p &lt; 0,05.</w:t>
+        <w:t>Wilks λ = 0,283; F(6,15) = 6,32; p = 0,002; η²ₚ = 0,72. * p &lt; 0,008 (α ajustado por Bonferroni para as seis dimensões).</w:t>
       </w:r>
     </w:p>
     <w:p>
@@ -10221,7 +10221,7 @@
           <w:b w:val="0"/>
           <w:sz w:val="24"/>
         </w:rPr>
-        <w:t>A análise multivariada confirmou a diferença entre o Dia 1 e o Dia 7 (Wilks λ = 0,283; F(6,15) = 6,32; p = 0,002; η²ₚ = 0,72), com efeito concentrado no vigor (d = -0,95) e na fadiga (d = +0,72) (Tabela 9; Figura 4). A resposta aguda pré → pós também foi multivariadamente significativa (Wilks λ = 0,423; p = 0,003), reforçando o achado do eixo energia–fadiga.</w:t>
+        <w:t>A análise multivariada confirmou a diferença entre o Dia 1 e o Dia 7 (Wilks λ = 0,283; F(6,15) = 6,32; p = 0,002; η²ₚ = 0,72). Nos testes univariados com o critério corrigido de Bonferroni (α = 0,008), apenas o vigor (d = -0,95) e a fadiga (d = +0,72) permaneceram significativos — evidenciando que o efeito se concentra no eixo energia–fadiga —, enquanto a tensão (p = 0,014) e a confusão (p = 0,049), significativas apenas sob α = 0,05, não resistiram à correção (Tabela 9; Figura 4). A resposta aguda pré → pós também foi multivariadamente significativa (Wilks λ = 0,423; p = 0,003), reforçando o achado.</w:t>
       </w:r>
     </w:p>
     <w:p>

</xml_diff>

<commit_message>
Add mood-profile cluster figure + prevalence benchmark to advanced report
Inserts into the mood-profiles section (3.9):
- the six-cluster T-score profile figure (one figure, as requested)
- an interpretive paragraph reproducing the Terry/Parsons-Smith cluster
  taxonomy and benchmarking our prevalences against the same-club Brazilian
  reference sample (de Miranda Rohlfs et al. 2024, 898 athletes): iceberg
  most prevalent in momentary assessment (34.3%) vs risk profiles least
  prevalent; our D1 starts iceberg-dominant, D7 raises shark fin (28.3%)
  well above the reference, with no relevant rise of the highest-risk
  profiles
- adds the 2024 citation

No existing number changes. The discriminant-function figure was left out
per request. 13 tables, 13 figures. Anonymized; leak scan clean.

Co-Authored-By: Claude Opus 4.8 <noreply@anthropic.com>
Claude-Session: https://claude.ai/code/session_01P7yGiDeoGDyjWvPWQVsUrj
</commit_message>
<xml_diff>
--- a/Artigos/Relatorio_Avancado_Perfil_Humor.docx
+++ b/Artigos/Relatorio_Avancado_Perfil_Humor.docx
@@ -12812,6 +12812,83 @@
     </w:p>
     <w:p>
       <w:pPr>
+        <w:spacing w:before="120"/>
+        <w:jc w:val="center"/>
+      </w:pPr>
+      <w:r>
+        <w:drawing>
+          <wp:inline xmlns:a="http://schemas.openxmlformats.org/drawingml/2006/main" xmlns:pic="http://schemas.openxmlformats.org/drawingml/2006/picture">
+            <wp:extent cx="5220000" cy="2839680"/>
+            <wp:docPr id="12" name="Picture 12"/>
+            <wp:cNvGraphicFramePr>
+              <a:graphicFrameLocks noChangeAspect="1"/>
+            </wp:cNvGraphicFramePr>
+            <a:graphic>
+              <a:graphicData uri="http://schemas.openxmlformats.org/drawingml/2006/picture">
+                <pic:pic>
+                  <pic:nvPicPr>
+                    <pic:cNvPr id="0" name="xb6_clusters.png"/>
+                    <pic:cNvPicPr/>
+                  </pic:nvPicPr>
+                  <pic:blipFill>
+                    <a:blip r:embed="rId20"/>
+                    <a:stretch>
+                      <a:fillRect/>
+                    </a:stretch>
+                  </pic:blipFill>
+                  <pic:spPr>
+                    <a:xfrm>
+                      <a:off x="0" y="0"/>
+                      <a:ext cx="5220000" cy="2839680"/>
+                    </a:xfrm>
+                    <a:prstGeom prst="rect"/>
+                  </pic:spPr>
+                </pic:pic>
+              </a:graphicData>
+            </a:graphic>
+          </wp:inline>
+        </w:drawing>
+      </w:r>
+    </w:p>
+    <w:p>
+      <w:pPr>
+        <w:jc w:val="center"/>
+      </w:pPr>
+      <w:r>
+        <w:rPr>
+          <w:sz w:val="22"/>
+        </w:rPr>
+        <w:t>Figura 12 – Perfis de humor (clusters) identificados na amostra, representados em escores T (M = 50; DP = 10) nas seis dimensões; percentuais entre parênteses.</w:t>
+      </w:r>
+    </w:p>
+    <w:p>
+      <w:pPr>
+        <w:spacing w:after="120"/>
+        <w:jc w:val="center"/>
+      </w:pPr>
+      <w:r>
+        <w:rPr>
+          <w:sz w:val="18"/>
+        </w:rPr>
+        <w:t>Fonte: elaboração dos autores (2026).</w:t>
+      </w:r>
+    </w:p>
+    <w:p>
+      <w:pPr>
+        <w:spacing w:line="360" w:lineRule="auto" w:after="120"/>
+        <w:ind w:firstLine="709"/>
+        <w:jc w:val="both"/>
+      </w:pPr>
+      <w:r>
+        <w:rPr>
+          <w:b w:val="0"/>
+          <w:sz w:val="24"/>
+        </w:rPr>
+        <w:t>A forma de cada cluster identificado na amostra (Figura 12) reproduz a taxonomia consagrada dos seis perfis de humor (PARSONS-SMITH; TERRY; MACHIN, 2017): o iceberg, com vigor elevado sobre dimensões negativas baixas; a barbatana de tubarão, com pico isolado de fadiga; o submerso, com todas as dimensões abaixo da média; e o Everest invertido, com todas as negativas elevadas. Comparada à distribuição de referência de uma grande amostra do mesmo contexto brasileiro (898 atletas de elite e de base; DE MIRANDA ROHLFS et al., 2024) — na qual, em avaliação momentânea, o iceberg foi o perfil mais prevalente (34,3%) e os perfis de risco os menos prevalentes (barbatana de tubarão 11,6%; iceberg invertido 6,2%; Everest invertido 2,7%) —, a nossa amostra parte de um predomínio de iceberg semelhante no Dia 1 (40%), mas, ao final do microciclo, eleva marcadamente a barbatana de tubarão (28% no Dia 7), muito acima do patamar de referência. Isso evidencia o efeito específico do acúmulo de carga da última semana de pré-temporada sobre o perfil de fadiga, sem instalação relevante dos perfis de maior risco à saúde mental (Everest invertido e submerso).</w:t>
+      </w:r>
+    </w:p>
+    <w:p>
+      <w:pPr>
         <w:spacing w:before="120" w:after="80" w:line="360" w:lineRule="auto"/>
       </w:pPr>
       <w:r>
@@ -14104,7 +14181,7 @@
         <w:drawing>
           <wp:inline xmlns:a="http://schemas.openxmlformats.org/drawingml/2006/main" xmlns:pic="http://schemas.openxmlformats.org/drawingml/2006/picture">
             <wp:extent cx="5400000" cy="3406154"/>
-            <wp:docPr id="12" name="Picture 12"/>
+            <wp:docPr id="13" name="Picture 13"/>
             <wp:cNvGraphicFramePr>
               <a:graphicFrameLocks noChangeAspect="1"/>
             </wp:cNvGraphicFramePr>
@@ -14116,7 +14193,7 @@
                     <pic:cNvPicPr/>
                   </pic:nvPicPr>
                   <pic:blipFill>
-                    <a:blip r:embed="rId20"/>
+                    <a:blip r:embed="rId21"/>
                     <a:stretch>
                       <a:fillRect/>
                     </a:stretch>
@@ -14143,7 +14220,7 @@
         <w:rPr>
           <w:sz w:val="22"/>
         </w:rPr>
-        <w:t>Figura 12 – Dispersão e reta de regressão (com banda de IC95%) entre o pico de velocidade do T-CAR e as médias semanais de vigor, fadiga, PTH e fadiga física.</w:t>
+        <w:t>Figura 13 – Dispersão e reta de regressão (com banda de IC95%) entre o pico de velocidade do T-CAR e as médias semanais de vigor, fadiga, PTH e fadiga física.</w:t>
       </w:r>
     </w:p>
     <w:p>
@@ -14169,7 +14246,7 @@
           <w:b w:val="0"/>
           <w:sz w:val="24"/>
         </w:rPr>
-        <w:t>O desempenho no T-CAR consta na Tabela 13. A regressão mostrou que atletas com maior pico de velocidade reportaram menos fadiga física (ρ = -0,54; p = 0,005) e mais vigor (ρ = +0,48; p = 0,015) ao longo da semana (Figura 12). A partir de um modelo que estima a probabilidade de um dia de fadiga elevada em função do pico de velocidade, identificou-se um limiar de aproximadamente 14,9 km/h (área sob a curva = 0,69; sensibilidade = 0,79; especificidade = 0,60): abaixo desse valor, os atletas apresentaram maior probabilidade de dias de fadiga elevada, o que fornece uma referência objetiva para individualizar a carga.</w:t>
+        <w:t>O desempenho no T-CAR consta na Tabela 13. A regressão mostrou que atletas com maior pico de velocidade reportaram menos fadiga física (ρ = -0,54; p = 0,005) e mais vigor (ρ = +0,48; p = 0,015) ao longo da semana (Figura 13). A partir de um modelo que estima a probabilidade de um dia de fadiga elevada em função do pico de velocidade, identificou-se um limiar de aproximadamente 14,9 km/h (área sob a curva = 0,69; sensibilidade = 0,79; especificidade = 0,60): abaixo desse valor, os atletas apresentaram maior probabilidade de dias de fadiga elevada, o que fornece uma referência objetiva para individualizar a carga.</w:t>
       </w:r>
     </w:p>
     <w:p>
@@ -14312,6 +14389,18 @@
           <w:sz w:val="22"/>
         </w:rPr>
         <w:t>BRANDT, R.; BEVILACQUA, G. G.; ANDRADE, A. Perceived sleep quality, mood states, and their relationship with performance among Brazilian elite athletes during a competitive period. Journal of Strength and Conditioning Research, v. 31, n. 4, p. 1033–1039, 2017.</w:t>
+      </w:r>
+    </w:p>
+    <w:p>
+      <w:pPr>
+        <w:spacing w:line="360" w:lineRule="auto" w:after="120"/>
+        <w:jc w:val="both"/>
+      </w:pPr>
+      <w:r>
+        <w:rPr>
+          <w:sz w:val="22"/>
+        </w:rPr>
+        <w:t>DE MIRANDA ROHLFS, I. C. P. et al. Prevalence of specific mood profile clusters among elite and youth athletes at a Brazilian sports club. Sports, v. 12, n. 7, 195, 2024. DOI: 10.3390/sports12070195.</w:t>
       </w:r>
     </w:p>
     <w:p>

</xml_diff>